<commit_message>
Point bundle docs to usnistgov TAS-AI repo
</commit_message>
<xml_diff>
--- a/paper/TAS-AI_Digital_Discovery.docx
+++ b/paper/TAS-AI_Digital_Discovery.docx
@@ -11709,7 +11709,7 @@
         <w:rPr>
           <w:rStyle w:val="VerbatimChar"/>
         </w:rPr>
-        <w:t xml:space="preserve">https://github.com/williamratcliff-nist/tasai</w:t>
+        <w:t xml:space="preserve">https://github.com/usnistgov/tasai</w:t>
       </w:r>
       <w:r>
         <w:t xml:space="preserve">. The manuscript source, figure-generation scripts, closed-loop drivers (</w:t>
@@ -11742,7 +11742,7 @@
         <w:rPr>
           <w:rStyle w:val="VerbatimChar"/>
         </w:rPr>
-        <w:t xml:space="preserve">https://github.com/williamratcliff-nist/paper-tasai</w:t>
+        <w:t xml:space="preserve">https://github.com/usnistgov/paper-tasai</w:t>
       </w:r>
       <w:r>
         <w:t xml:space="preserve">. Prompt artifacts used for the pilot audit layer are described in the Supplementary Information.</w:t>

</xml_diff>